<commit_message>
Atualização resultados preliminares HeteroGNN vs XGBoost
</commit_message>
<xml_diff>
--- a/docs/exploratory_analysis/EDA - Exploratory Data Analysis.docx
+++ b/docs/exploratory_analysis/EDA - Exploratory Data Analysis.docx
@@ -1390,13 +1390,12 @@
         <w:rPr>
           <w:b/>
           <w:bCs/>
-          <w:noProof/>
         </w:rPr>
         <w:drawing>
-          <wp:inline distT="0" distB="0" distL="0" distR="0" wp14:anchorId="549AA5DC" wp14:editId="4BD9D0EC">
-            <wp:extent cx="5400040" cy="2838450"/>
-            <wp:effectExtent l="0" t="0" r="0" b="0"/>
-            <wp:docPr id="569796223" name="Imagem 1"/>
+          <wp:inline distT="0" distB="0" distL="0" distR="0" wp14:anchorId="6ED4DF6B" wp14:editId="78F8C920">
+            <wp:extent cx="5400040" cy="3003550"/>
+            <wp:effectExtent l="0" t="0" r="0" b="6350"/>
+            <wp:docPr id="1285474601" name="Imagem 1"/>
             <wp:cNvGraphicFramePr>
               <a:graphicFrameLocks xmlns:a="http://schemas.openxmlformats.org/drawingml/2006/main" noChangeAspect="1"/>
             </wp:cNvGraphicFramePr>
@@ -1404,7 +1403,7 @@
               <a:graphicData uri="http://schemas.openxmlformats.org/drawingml/2006/picture">
                 <pic:pic xmlns:pic="http://schemas.openxmlformats.org/drawingml/2006/picture">
                   <pic:nvPicPr>
-                    <pic:cNvPr id="569796223" name=""/>
+                    <pic:cNvPr id="1285474601" name=""/>
                     <pic:cNvPicPr/>
                   </pic:nvPicPr>
                   <pic:blipFill>
@@ -1416,7 +1415,7 @@
                   <pic:spPr>
                     <a:xfrm>
                       <a:off x="0" y="0"/>
-                      <a:ext cx="5400040" cy="2838450"/>
+                      <a:ext cx="5400040" cy="3003550"/>
                     </a:xfrm>
                     <a:prstGeom prst="rect">
                       <a:avLst/>
@@ -1513,7 +1512,6 @@
           <w:b/>
           <w:bCs/>
         </w:rPr>
-        <w:lastRenderedPageBreak/>
         <w:t>6</w:t>
       </w:r>
       <w:r>

</xml_diff>